<commit_message>
0.4.0 FUNC: add recurring events and scheduling updates
Add task/event timing, recurrence rules, occurrence-level completion, expanded color selection, and responsive calendar layout updates.
</commit_message>
<xml_diff>
--- a/dev_note.docx
+++ b/dev_note.docx
@@ -20,108 +20,309 @@
         </w:rPr>
         <w:t>26.10.17，19:45</w:t>
       </w:r>
+    </w:p>
+    <w:p>
+      <w:pPr>
+        <w:rPr>
+          <w:rFonts w:hint="default" w:ascii="宋体" w:hAnsi="宋体" w:eastAsia="宋体" w:cs="宋体"/>
+          <w:sz w:val="24"/>
+          <w:szCs w:val="24"/>
+          <w:lang w:val="en-US" w:eastAsia="zh-CN"/>
+        </w:rPr>
+      </w:pPr>
+      <w:r>
+        <w:rPr>
+          <w:rFonts w:hint="eastAsia" w:ascii="宋体" w:hAnsi="宋体" w:eastAsia="宋体" w:cs="宋体"/>
+          <w:sz w:val="24"/>
+          <w:szCs w:val="24"/>
+          <w:lang w:val="en-US" w:eastAsia="zh-CN"/>
+        </w:rPr>
+        <w:t>现在的日程太多，记不住。</w:t>
+      </w:r>
+    </w:p>
+    <w:p>
+      <w:pPr>
+        <w:rPr>
+          <w:rFonts w:ascii="宋体" w:hAnsi="宋体" w:eastAsia="宋体" w:cs="宋体"/>
+          <w:sz w:val="24"/>
+          <w:szCs w:val="24"/>
+        </w:rPr>
+      </w:pPr>
+      <w:r>
+        <w:rPr>
+          <w:rFonts w:ascii="宋体" w:hAnsi="宋体" w:eastAsia="宋体" w:cs="宋体"/>
+          <w:sz w:val="24"/>
+          <w:szCs w:val="24"/>
+        </w:rPr>
+        <w:t>在这个项目中，我要做一个web极简日程表。目前预计的技术栈是vercel、GitHub、supabase、nextjs，</w:t>
+      </w:r>
+      <w:r>
+        <w:rPr>
+          <w:rFonts w:hint="eastAsia" w:ascii="宋体" w:hAnsi="宋体" w:eastAsia="宋体" w:cs="宋体"/>
+          <w:sz w:val="24"/>
+          <w:szCs w:val="24"/>
+          <w:lang w:val="en-US" w:eastAsia="zh-CN"/>
+        </w:rPr>
+        <w:t>PWA。</w:t>
+      </w:r>
+      <w:r>
+        <w:rPr>
+          <w:rFonts w:ascii="宋体" w:hAnsi="宋体" w:eastAsia="宋体" w:cs="宋体"/>
+          <w:sz w:val="24"/>
+          <w:szCs w:val="24"/>
+        </w:rPr>
+        <w:t>本机环境要开conda</w:t>
+      </w:r>
+      <w:r>
+        <w:rPr>
+          <w:rFonts w:hint="eastAsia" w:ascii="宋体" w:hAnsi="宋体" w:eastAsia="宋体" w:cs="宋体"/>
+          <w:sz w:val="24"/>
+          <w:szCs w:val="24"/>
+          <w:lang w:eastAsia="zh-CN"/>
+        </w:rPr>
+        <w:t>。</w:t>
+      </w:r>
+    </w:p>
+    <w:p>
+      <w:pPr>
+        <w:rPr>
+          <w:rFonts w:hint="eastAsia" w:ascii="宋体" w:hAnsi="宋体" w:eastAsia="宋体" w:cs="宋体"/>
+          <w:sz w:val="24"/>
+          <w:szCs w:val="24"/>
+          <w:lang w:val="en-US" w:eastAsia="zh-CN"/>
+        </w:rPr>
+      </w:pPr>
+      <w:r>
+        <w:rPr>
+          <w:rFonts w:hint="eastAsia" w:ascii="宋体" w:hAnsi="宋体" w:eastAsia="宋体" w:cs="宋体"/>
+          <w:sz w:val="24"/>
+          <w:szCs w:val="24"/>
+          <w:lang w:val="en-US" w:eastAsia="zh-CN"/>
+        </w:rPr>
+        <w:t>目前暂时用免费方案做一版，未来看情况升级成apk or aliyun server。</w:t>
+      </w:r>
+    </w:p>
+    <w:p>
+      <w:pPr>
+        <w:rPr>
+          <w:rFonts w:hint="eastAsia" w:ascii="宋体" w:hAnsi="宋体" w:eastAsia="宋体" w:cs="宋体"/>
+          <w:sz w:val="24"/>
+          <w:szCs w:val="24"/>
+          <w:lang w:val="en-US" w:eastAsia="zh-CN"/>
+        </w:rPr>
+      </w:pPr>
+      <w:r>
+        <w:rPr>
+          <w:rFonts w:hint="eastAsia" w:ascii="宋体" w:hAnsi="宋体" w:eastAsia="宋体" w:cs="宋体"/>
+          <w:sz w:val="24"/>
+          <w:szCs w:val="24"/>
+          <w:lang w:val="en-US" w:eastAsia="zh-CN"/>
+        </w:rPr>
+        <w:t>我还建了rules_for_codex.txt，为了尽量满足我的要求来建设这个project。祝好</w:t>
+      </w:r>
+    </w:p>
+    <w:p>
+      <w:pPr>
+        <w:rPr>
+          <w:rFonts w:hint="eastAsia" w:ascii="宋体" w:hAnsi="宋体" w:eastAsia="宋体" w:cs="宋体"/>
+          <w:sz w:val="24"/>
+          <w:szCs w:val="24"/>
+          <w:lang w:val="en-US" w:eastAsia="zh-CN"/>
+        </w:rPr>
+      </w:pPr>
+    </w:p>
+    <w:p>
+      <w:pPr>
+        <w:rPr>
+          <w:rFonts w:hint="eastAsia" w:ascii="宋体" w:hAnsi="宋体" w:eastAsia="宋体" w:cs="宋体"/>
+          <w:sz w:val="24"/>
+          <w:szCs w:val="24"/>
+          <w:lang w:val="en-US" w:eastAsia="zh-CN"/>
+        </w:rPr>
+      </w:pPr>
+      <w:r>
+        <w:rPr>
+          <w:rFonts w:hint="eastAsia" w:ascii="宋体" w:hAnsi="宋体" w:eastAsia="宋体" w:cs="宋体"/>
+          <w:sz w:val="24"/>
+          <w:szCs w:val="24"/>
+          <w:lang w:val="en-US" w:eastAsia="zh-CN"/>
+        </w:rPr>
+        <w:t>21:26</w:t>
+      </w:r>
+    </w:p>
+    <w:p>
+      <w:pPr>
+        <w:rPr>
+          <w:rFonts w:hint="eastAsia" w:ascii="宋体" w:hAnsi="宋体" w:eastAsia="宋体" w:cs="宋体"/>
+          <w:sz w:val="24"/>
+          <w:szCs w:val="24"/>
+          <w:lang w:val="en-US" w:eastAsia="zh-CN"/>
+        </w:rPr>
+      </w:pPr>
+      <w:r>
+        <w:rPr>
+          <w:rFonts w:hint="eastAsia" w:ascii="宋体" w:hAnsi="宋体" w:eastAsia="宋体" w:cs="宋体"/>
+          <w:sz w:val="24"/>
+          <w:szCs w:val="24"/>
+          <w:lang w:val="en-US" w:eastAsia="zh-CN"/>
+        </w:rPr>
+        <w:t>和codex聊天真费劲。规矩定多了效率低，定少了又不知道干了什么</w:t>
+      </w:r>
+    </w:p>
+    <w:p>
+      <w:pPr>
+        <w:rPr>
+          <w:rFonts w:hint="eastAsia" w:ascii="宋体" w:hAnsi="宋体" w:eastAsia="宋体" w:cs="宋体"/>
+          <w:sz w:val="24"/>
+          <w:szCs w:val="24"/>
+          <w:lang w:val="en-US" w:eastAsia="zh-CN"/>
+        </w:rPr>
+      </w:pPr>
+      <w:r>
+        <w:rPr>
+          <w:rFonts w:hint="eastAsia" w:ascii="宋体" w:hAnsi="宋体" w:eastAsia="宋体" w:cs="宋体"/>
+          <w:sz w:val="24"/>
+          <w:szCs w:val="24"/>
+          <w:lang w:val="en-US" w:eastAsia="zh-CN"/>
+        </w:rPr>
+        <w:t>现在配好supabase+GitHub了，测试一下连通性</w:t>
+      </w:r>
+    </w:p>
+    <w:p>
+      <w:pPr>
+        <w:rPr>
+          <w:rFonts w:hint="eastAsia" w:ascii="宋体" w:hAnsi="宋体" w:eastAsia="宋体" w:cs="宋体"/>
+          <w:sz w:val="24"/>
+          <w:szCs w:val="24"/>
+          <w:lang w:val="en-US" w:eastAsia="zh-CN"/>
+        </w:rPr>
+      </w:pPr>
+    </w:p>
+    <w:p>
+      <w:pPr>
+        <w:rPr>
+          <w:rFonts w:hint="eastAsia" w:ascii="宋体" w:hAnsi="宋体" w:eastAsia="宋体" w:cs="宋体"/>
+          <w:sz w:val="24"/>
+          <w:szCs w:val="24"/>
+          <w:lang w:val="en-US" w:eastAsia="zh-CN"/>
+        </w:rPr>
+      </w:pPr>
+      <w:r>
+        <w:rPr>
+          <w:rFonts w:hint="eastAsia" w:ascii="宋体" w:hAnsi="宋体" w:eastAsia="宋体" w:cs="宋体"/>
+          <w:sz w:val="24"/>
+          <w:szCs w:val="24"/>
+          <w:lang w:val="en-US" w:eastAsia="zh-CN"/>
+        </w:rPr>
+        <w:t>21:58</w:t>
+      </w:r>
+    </w:p>
+    <w:p>
+      <w:pPr>
+        <w:rPr>
+          <w:rFonts w:hint="default" w:ascii="宋体" w:hAnsi="宋体" w:eastAsia="宋体" w:cs="宋体"/>
+          <w:sz w:val="24"/>
+          <w:szCs w:val="24"/>
+          <w:lang w:val="en-US" w:eastAsia="zh-CN"/>
+        </w:rPr>
+      </w:pPr>
+      <w:r>
+        <w:rPr>
+          <w:rFonts w:hint="eastAsia" w:ascii="宋体" w:hAnsi="宋体" w:eastAsia="宋体" w:cs="宋体"/>
+          <w:sz w:val="24"/>
+          <w:szCs w:val="24"/>
+          <w:lang w:val="en-US" w:eastAsia="zh-CN"/>
+        </w:rPr>
+        <w:t>有一个人提建议，要接模型可以语音识别一段需求，自动转json做新建事项的input prompt，他还很过分，展望未来AI帮你把schedule全做了，懒狗一个。</w:t>
+      </w:r>
+    </w:p>
+    <w:p>
+      <w:pPr>
+        <w:rPr>
+          <w:rFonts w:hint="eastAsia" w:ascii="宋体" w:hAnsi="宋体" w:eastAsia="宋体" w:cs="宋体"/>
+          <w:sz w:val="24"/>
+          <w:szCs w:val="24"/>
+          <w:lang w:val="en-US" w:eastAsia="zh-CN"/>
+        </w:rPr>
+      </w:pPr>
+      <w:r>
+        <w:rPr>
+          <w:rFonts w:hint="eastAsia" w:ascii="宋体" w:hAnsi="宋体" w:eastAsia="宋体" w:cs="宋体"/>
+          <w:sz w:val="24"/>
+          <w:szCs w:val="24"/>
+          <w:lang w:val="en-US" w:eastAsia="zh-CN"/>
+        </w:rPr>
+        <w:t>那么可以加一个important的选项， 无论何时，ddl还有多久，都在当天里面提醒。保持按时间排序。</w:t>
+      </w:r>
+    </w:p>
+    <w:p>
+      <w:pPr>
+        <w:rPr>
+          <w:rFonts w:hint="eastAsia" w:ascii="宋体" w:hAnsi="宋体" w:eastAsia="宋体" w:cs="宋体"/>
+          <w:sz w:val="24"/>
+          <w:szCs w:val="24"/>
+          <w:lang w:val="en-US" w:eastAsia="zh-CN"/>
+        </w:rPr>
+      </w:pPr>
+    </w:p>
+    <w:p>
+      <w:pPr>
+        <w:rPr>
+          <w:rFonts w:hint="eastAsia" w:ascii="宋体" w:hAnsi="宋体" w:eastAsia="宋体" w:cs="宋体"/>
+          <w:sz w:val="24"/>
+          <w:szCs w:val="24"/>
+          <w:lang w:val="en-US" w:eastAsia="zh-CN"/>
+        </w:rPr>
+      </w:pPr>
+      <w:r>
+        <w:rPr>
+          <w:rFonts w:hint="eastAsia" w:ascii="宋体" w:hAnsi="宋体" w:eastAsia="宋体" w:cs="宋体"/>
+          <w:sz w:val="24"/>
+          <w:szCs w:val="24"/>
+          <w:lang w:val="en-US" w:eastAsia="zh-CN"/>
+        </w:rPr>
+        <w:t>12:41</w:t>
+      </w:r>
+    </w:p>
+    <w:p>
+      <w:pPr>
+        <w:rPr>
+          <w:rFonts w:hint="eastAsia" w:ascii="宋体" w:hAnsi="宋体" w:eastAsia="宋体" w:cs="宋体"/>
+          <w:sz w:val="24"/>
+          <w:szCs w:val="24"/>
+          <w:lang w:val="en-US" w:eastAsia="zh-CN"/>
+        </w:rPr>
+      </w:pPr>
+      <w:r>
+        <w:rPr>
+          <w:rFonts w:hint="eastAsia" w:ascii="宋体" w:hAnsi="宋体" w:eastAsia="宋体" w:cs="宋体"/>
+          <w:sz w:val="24"/>
+          <w:szCs w:val="24"/>
+          <w:lang w:val="en-US" w:eastAsia="zh-CN"/>
+        </w:rPr>
+        <w:t>做了个雏形，也部署到vercel了，但是一来手机版适配没做好，二来现在需要直接访问vercel的子域名，所以需要VPN访问，明天看看有没有解决方案。还需要加上DDL、分两type之类的。</w:t>
+      </w:r>
+    </w:p>
+    <w:p>
+      <w:pPr>
+        <w:rPr>
+          <w:rFonts w:hint="default" w:ascii="宋体" w:hAnsi="宋体" w:eastAsia="宋体" w:cs="宋体"/>
+          <w:sz w:val="24"/>
+          <w:szCs w:val="24"/>
+          <w:lang w:val="en-US" w:eastAsia="zh-CN"/>
+        </w:rPr>
+      </w:pPr>
+      <w:r>
+        <w:rPr>
+          <w:rFonts w:hint="eastAsia" w:ascii="宋体" w:hAnsi="宋体" w:eastAsia="宋体" w:cs="宋体"/>
+          <w:sz w:val="24"/>
+          <w:szCs w:val="24"/>
+          <w:lang w:val="en-US" w:eastAsia="zh-CN"/>
+        </w:rPr>
+        <w:t>还需要修改一些细微处的前端文本，然后补充一点颜色，最好有随机颜色</w:t>
+      </w:r>
       <w:bookmarkStart w:id="0" w:name="_GoBack"/>
       <w:bookmarkEnd w:id="0"/>
-    </w:p>
-    <w:p>
-      <w:pPr>
-        <w:rPr>
-          <w:rFonts w:hint="default" w:ascii="宋体" w:hAnsi="宋体" w:eastAsia="宋体" w:cs="宋体"/>
-          <w:sz w:val="24"/>
-          <w:szCs w:val="24"/>
-          <w:lang w:val="en-US" w:eastAsia="zh-CN"/>
-        </w:rPr>
-      </w:pPr>
-      <w:r>
-        <w:rPr>
-          <w:rFonts w:hint="eastAsia" w:ascii="宋体" w:hAnsi="宋体" w:eastAsia="宋体" w:cs="宋体"/>
-          <w:sz w:val="24"/>
-          <w:szCs w:val="24"/>
-          <w:lang w:val="en-US" w:eastAsia="zh-CN"/>
-        </w:rPr>
-        <w:t>现在的日程太多，记不住。</w:t>
-      </w:r>
-    </w:p>
-    <w:p>
-      <w:pPr>
-        <w:rPr>
-          <w:rFonts w:ascii="宋体" w:hAnsi="宋体" w:eastAsia="宋体" w:cs="宋体"/>
-          <w:sz w:val="24"/>
-          <w:szCs w:val="24"/>
-        </w:rPr>
-      </w:pPr>
-      <w:r>
-        <w:rPr>
-          <w:rFonts w:ascii="宋体" w:hAnsi="宋体" w:eastAsia="宋体" w:cs="宋体"/>
-          <w:sz w:val="24"/>
-          <w:szCs w:val="24"/>
-        </w:rPr>
-        <w:t>在这个项目中，我要做一个web极简日程表。目前预计的技术栈是vercel、GitHub、supabase、nextjs，</w:t>
-      </w:r>
-      <w:r>
-        <w:rPr>
-          <w:rFonts w:hint="eastAsia" w:ascii="宋体" w:hAnsi="宋体" w:eastAsia="宋体" w:cs="宋体"/>
-          <w:sz w:val="24"/>
-          <w:szCs w:val="24"/>
-          <w:lang w:val="en-US" w:eastAsia="zh-CN"/>
-        </w:rPr>
-        <w:t>PWA。</w:t>
-      </w:r>
-      <w:r>
-        <w:rPr>
-          <w:rFonts w:ascii="宋体" w:hAnsi="宋体" w:eastAsia="宋体" w:cs="宋体"/>
-          <w:sz w:val="24"/>
-          <w:szCs w:val="24"/>
-        </w:rPr>
-        <w:t>本机环境要开conda</w:t>
-      </w:r>
-      <w:r>
-        <w:rPr>
-          <w:rFonts w:hint="eastAsia" w:ascii="宋体" w:hAnsi="宋体" w:eastAsia="宋体" w:cs="宋体"/>
-          <w:sz w:val="24"/>
-          <w:szCs w:val="24"/>
-          <w:lang w:eastAsia="zh-CN"/>
-        </w:rPr>
-        <w:t>。</w:t>
-      </w:r>
-    </w:p>
-    <w:p>
-      <w:pPr>
-        <w:rPr>
-          <w:rFonts w:hint="eastAsia" w:ascii="宋体" w:hAnsi="宋体" w:eastAsia="宋体" w:cs="宋体"/>
-          <w:sz w:val="24"/>
-          <w:szCs w:val="24"/>
-          <w:lang w:val="en-US" w:eastAsia="zh-CN"/>
-        </w:rPr>
-      </w:pPr>
-      <w:r>
-        <w:rPr>
-          <w:rFonts w:hint="eastAsia" w:ascii="宋体" w:hAnsi="宋体" w:eastAsia="宋体" w:cs="宋体"/>
-          <w:sz w:val="24"/>
-          <w:szCs w:val="24"/>
-          <w:lang w:val="en-US" w:eastAsia="zh-CN"/>
-        </w:rPr>
-        <w:t>目前暂时用免费方案做一版，未来看情况升级成apk or aliyun server。</w:t>
-      </w:r>
-    </w:p>
-    <w:p>
-      <w:pPr>
-        <w:rPr>
-          <w:rFonts w:hint="default" w:ascii="宋体" w:hAnsi="宋体" w:eastAsia="宋体" w:cs="宋体"/>
-          <w:sz w:val="24"/>
-          <w:szCs w:val="24"/>
-          <w:lang w:val="en-US" w:eastAsia="zh-CN"/>
-        </w:rPr>
-      </w:pPr>
-      <w:r>
-        <w:rPr>
-          <w:rFonts w:hint="eastAsia" w:ascii="宋体" w:hAnsi="宋体" w:eastAsia="宋体" w:cs="宋体"/>
-          <w:sz w:val="24"/>
-          <w:szCs w:val="24"/>
-          <w:lang w:val="en-US" w:eastAsia="zh-CN"/>
-        </w:rPr>
-        <w:t>我还建了rules_for_codex.txt，为了尽量满足我的要求来建设这个project。祝好</w:t>
-      </w:r>
     </w:p>
     <w:sectPr>
       <w:pgSz w:w="11906" w:h="16838"/>

</xml_diff>